<commit_message>
chore: set production URL
</commit_message>
<xml_diff>
--- a/docs/GitHub与Vercel上传部署步骤.docx
+++ b/docs/GitHub与Vercel上传部署步骤.docx
@@ -215,6 +215,11 @@
       </w:pPr>
       <w:r>
         <w:t>示例文章和项目上线后可继续替换成真实内容。</w:t>
+      </w:r>
+    </w:p>
+    <w:p>
+      <w:r>
+        <w:t>正式地址：https://personal-blog-gamma-six.vercel.app</w:t>
       </w:r>
     </w:p>
     <w:sectPr>

</xml_diff>